<commit_message>
Recria Ads: pronúncia de Leang Karampuang e Sulawesi
Co-Authored-By: Claude Opus 5.5 <noreply@anthropic.com>
Claude-Session: https://claude.ai/code/session_01RDM8d5cVD9w4uwiMSyLkgt
</commit_message>
<xml_diff>
--- a/agencia-recria/cursos/recria-ads/para-ler-e-gravar/Guia de pronuncia dos autores.docx
+++ b/agencia-recria/cursos/recria-ads/para-ler-e-gravar/Guia de pronuncia dos autores.docx
@@ -1153,6 +1153,41 @@
           </w:p>
         </w:tc>
       </w:tr>
+      <w:tr>
+        <w:tc>
+          <w:tcPr>
+            <w:tcW w:type="dxa" w:w="3249"/>
+          </w:tcPr>
+          <w:p>
+            <w:r/>
+            <w:r>
+              <w:t>Leang Karampuang · Sulawesi</w:t>
+            </w:r>
+          </w:p>
+        </w:tc>
+        <w:tc>
+          <w:tcPr>
+            <w:tcW w:type="dxa" w:w="3249"/>
+          </w:tcPr>
+          <w:p>
+            <w:r/>
+            <w:r>
+              <w:t>lê-ANG ka-ram-PU-ang · su-la-UÊ-si</w:t>
+            </w:r>
+          </w:p>
+        </w:tc>
+        <w:tc>
+          <w:tcPr>
+            <w:tcW w:type="dxa" w:w="3249"/>
+          </w:tcPr>
+          <w:p>
+            <w:r/>
+            <w:r>
+              <w:t>(a caverna da pintura de 51.200 anos, aula 2.1)</w:t>
+            </w:r>
+          </w:p>
+        </w:tc>
+      </w:tr>
     </w:tbl>
     <w:p/>
     <w:p>

</xml_diff>